<commit_message>
feat: split training plan by experience level (Bro Split for beginners, PPL for experienced)
</commit_message>
<xml_diff>
--- a/plans/sent/Shahid_Khan_plan.docx
+++ b/plans/sent/Shahid_Khan_plan.docx
@@ -67,7 +67,15 @@
           <w:color w:val="6C28D2"/>
           <w:sz w:val="32"/>
         </w:rPr>
-        <w:t>📋  CLIENT SUMMARY</w:t>
+        <w:t>📋</w:t>
+      </w:r>
+      <w:r>
+        <w:rPr>
+          <w:b/>
+          <w:color w:val="6C28D2"/>
+          <w:sz w:val="32"/>
+        </w:rPr>
+        <w:t xml:space="preserve">  CLIENT SUMMARY</w:t>
       </w:r>
     </w:p>
     <w:tbl>
@@ -459,15 +467,31 @@
           <w:b/>
           <w:color w:val="2D0A6E"/>
         </w:rPr>
-        <w:t xml:space="preserve">🔍 Physique Insight: </w:t>
+        <w:t>🔍</w:t>
+      </w:r>
+      <w:r>
+        <w:rPr>
+          <w:b/>
+          <w:color w:val="2D0A6E"/>
+        </w:rPr>
+        <w:t xml:space="preserve"> Physique Insight: </w:t>
       </w:r>
       <w:r>
         <w:rPr>
           <w:i/>
           <w:sz w:val="20"/>
         </w:rPr>
-        <w:t>Shahid, your current BMI of 23.2 is healthy, and your body fat percentage of 20.1% falls within the average range. With 46.3 kg of lean body mass and 11.7 kg of fat mass, you have a solid foundation to build upon. Your primary goal of muscle gain is perfectly achievable, and this protocol is designed to help you effectively increase lean mass and strength. Consistency and dedication will be key to transforming your physique</w:t>
+        <w:t xml:space="preserve">Shahid, your current BMI of 23.2 is healthy, and your body fat percentage of 20.1% falls within the average range. With 46.3 kg of lean body mass and 11.7 kg of fat mass, you have a solid foundation to build upon. Your primary goal of muscle gain is perfectly achievable, and this protocol is designed to help you effectively increase lean mass and strength. Consistency and dedication will be key to transforming your </w:t>
       </w:r>
+      <w:proofErr w:type="gramStart"/>
+      <w:r>
+        <w:rPr>
+          <w:i/>
+          <w:sz w:val="20"/>
+        </w:rPr>
+        <w:t>physique</w:t>
+      </w:r>
+      <w:proofErr w:type="gramEnd"/>
       <w:r>
         <w:rPr>
           <w:i/>
@@ -494,7 +518,23 @@
           <w:color w:val="FF6B35"/>
           <w:sz w:val="32"/>
         </w:rPr>
-        <w:t>🍽️  NUTRITION PLAN</w:t>
+        <w:t>🍽</w:t>
+      </w:r>
+      <w:r>
+        <w:rPr>
+          <w:b/>
+          <w:color w:val="FF6B35"/>
+          <w:sz w:val="32"/>
+        </w:rPr>
+        <w:t>️</w:t>
+      </w:r>
+      <w:r>
+        <w:rPr>
+          <w:b/>
+          <w:color w:val="FF6B35"/>
+          <w:sz w:val="32"/>
+        </w:rPr>
+        <w:t xml:space="preserve">  NUTRITION PLAN</w:t>
       </w:r>
     </w:p>
     <w:tbl>
@@ -535,7 +575,14 @@
                 <w:b/>
                 <w:sz w:val="18"/>
               </w:rPr>
-              <w:t>🔥 Calories</w:t>
+              <w:t>🔥</w:t>
+            </w:r>
+            <w:r>
+              <w:rPr>
+                <w:b/>
+                <w:sz w:val="18"/>
+              </w:rPr>
+              <w:t xml:space="preserve"> Calories</w:t>
             </w:r>
             <w:r>
               <w:rPr>
@@ -568,7 +615,14 @@
                 <w:b/>
                 <w:sz w:val="18"/>
               </w:rPr>
-              <w:t>🥩 Protein</w:t>
+              <w:t>🥩</w:t>
+            </w:r>
+            <w:r>
+              <w:rPr>
+                <w:b/>
+                <w:sz w:val="18"/>
+              </w:rPr>
+              <w:t xml:space="preserve"> Protein</w:t>
             </w:r>
             <w:r>
               <w:rPr>
@@ -601,7 +655,14 @@
                 <w:b/>
                 <w:sz w:val="18"/>
               </w:rPr>
-              <w:t>🍚 Carbs</w:t>
+              <w:t>🍚</w:t>
+            </w:r>
+            <w:r>
+              <w:rPr>
+                <w:b/>
+                <w:sz w:val="18"/>
+              </w:rPr>
+              <w:t xml:space="preserve"> Carbs</w:t>
             </w:r>
             <w:r>
               <w:rPr>
@@ -634,7 +695,14 @@
                 <w:b/>
                 <w:sz w:val="18"/>
               </w:rPr>
-              <w:t>🥑 Fats</w:t>
+              <w:t>🥑</w:t>
+            </w:r>
+            <w:r>
+              <w:rPr>
+                <w:b/>
+                <w:sz w:val="18"/>
+              </w:rPr>
+              <w:t xml:space="preserve"> Fats</w:t>
             </w:r>
             <w:r>
               <w:rPr>
@@ -687,7 +755,14 @@
           <w:color w:val="FF6B35"/>
           <w:sz w:val="20"/>
         </w:rPr>
-        <w:t xml:space="preserve">▸ </w:t>
+        <w:t>▸</w:t>
+      </w:r>
+      <w:r>
+        <w:rPr>
+          <w:color w:val="FF6B35"/>
+          <w:sz w:val="20"/>
+        </w:rPr>
+        <w:t xml:space="preserve"> </w:t>
       </w:r>
       <w:r>
         <w:rPr>
@@ -707,7 +782,15 @@
           <w:color w:val="27AE60"/>
           <w:sz w:val="18"/>
         </w:rPr>
-        <w:t xml:space="preserve">↻ Alternative: </w:t>
+        <w:t>↻</w:t>
+      </w:r>
+      <w:r>
+        <w:rPr>
+          <w:b/>
+          <w:color w:val="27AE60"/>
+          <w:sz w:val="18"/>
+        </w:rPr>
+        <w:t xml:space="preserve"> Alternative: </w:t>
       </w:r>
       <w:r>
         <w:rPr>
@@ -763,7 +846,14 @@
           <w:color w:val="FF6B35"/>
           <w:sz w:val="20"/>
         </w:rPr>
-        <w:t xml:space="preserve">▸ </w:t>
+        <w:t>▸</w:t>
+      </w:r>
+      <w:r>
+        <w:rPr>
+          <w:color w:val="FF6B35"/>
+          <w:sz w:val="20"/>
+        </w:rPr>
+        <w:t xml:space="preserve"> </w:t>
       </w:r>
       <w:r>
         <w:rPr>
@@ -783,7 +873,15 @@
           <w:color w:val="27AE60"/>
           <w:sz w:val="18"/>
         </w:rPr>
-        <w:t xml:space="preserve">↻ Alternative: </w:t>
+        <w:t>↻</w:t>
+      </w:r>
+      <w:r>
+        <w:rPr>
+          <w:b/>
+          <w:color w:val="27AE60"/>
+          <w:sz w:val="18"/>
+        </w:rPr>
+        <w:t xml:space="preserve"> Alternative: </w:t>
       </w:r>
       <w:r>
         <w:rPr>
@@ -838,7 +936,14 @@
           <w:color w:val="FF6B35"/>
           <w:sz w:val="20"/>
         </w:rPr>
-        <w:t xml:space="preserve">▸ </w:t>
+        <w:t>▸</w:t>
+      </w:r>
+      <w:r>
+        <w:rPr>
+          <w:color w:val="FF6B35"/>
+          <w:sz w:val="20"/>
+        </w:rPr>
+        <w:t xml:space="preserve"> </w:t>
       </w:r>
       <w:r>
         <w:rPr>
@@ -858,7 +963,15 @@
           <w:color w:val="27AE60"/>
           <w:sz w:val="18"/>
         </w:rPr>
-        <w:t xml:space="preserve">↻ Alternative: </w:t>
+        <w:t>↻</w:t>
+      </w:r>
+      <w:r>
+        <w:rPr>
+          <w:b/>
+          <w:color w:val="27AE60"/>
+          <w:sz w:val="18"/>
+        </w:rPr>
+        <w:t xml:space="preserve"> Alternative: </w:t>
       </w:r>
       <w:r>
         <w:rPr>
@@ -913,7 +1026,14 @@
           <w:color w:val="FF6B35"/>
           <w:sz w:val="20"/>
         </w:rPr>
-        <w:t xml:space="preserve">▸ </w:t>
+        <w:t>▸</w:t>
+      </w:r>
+      <w:r>
+        <w:rPr>
+          <w:color w:val="FF6B35"/>
+          <w:sz w:val="20"/>
+        </w:rPr>
+        <w:t xml:space="preserve"> </w:t>
       </w:r>
       <w:r>
         <w:rPr>
@@ -933,7 +1053,15 @@
           <w:color w:val="27AE60"/>
           <w:sz w:val="18"/>
         </w:rPr>
-        <w:t xml:space="preserve">↻ Alternative: </w:t>
+        <w:t>↻</w:t>
+      </w:r>
+      <w:r>
+        <w:rPr>
+          <w:b/>
+          <w:color w:val="27AE60"/>
+          <w:sz w:val="18"/>
+        </w:rPr>
+        <w:t xml:space="preserve"> Alternative: </w:t>
       </w:r>
       <w:r>
         <w:rPr>
@@ -988,7 +1116,14 @@
           <w:color w:val="FF6B35"/>
           <w:sz w:val="20"/>
         </w:rPr>
-        <w:t xml:space="preserve">▸ </w:t>
+        <w:t>▸</w:t>
+      </w:r>
+      <w:r>
+        <w:rPr>
+          <w:color w:val="FF6B35"/>
+          <w:sz w:val="20"/>
+        </w:rPr>
+        <w:t xml:space="preserve"> </w:t>
       </w:r>
       <w:r>
         <w:rPr>
@@ -1008,7 +1143,15 @@
           <w:color w:val="27AE60"/>
           <w:sz w:val="18"/>
         </w:rPr>
-        <w:t xml:space="preserve">↻ Alternative: </w:t>
+        <w:t>↻</w:t>
+      </w:r>
+      <w:r>
+        <w:rPr>
+          <w:b/>
+          <w:color w:val="27AE60"/>
+          <w:sz w:val="18"/>
+        </w:rPr>
+        <w:t xml:space="preserve"> Alternative: </w:t>
       </w:r>
       <w:r>
         <w:rPr>
@@ -1063,7 +1206,14 @@
           <w:color w:val="FF6B35"/>
           <w:sz w:val="20"/>
         </w:rPr>
-        <w:t xml:space="preserve">▸ </w:t>
+        <w:t>▸</w:t>
+      </w:r>
+      <w:r>
+        <w:rPr>
+          <w:color w:val="FF6B35"/>
+          <w:sz w:val="20"/>
+        </w:rPr>
+        <w:t xml:space="preserve"> </w:t>
       </w:r>
       <w:r>
         <w:rPr>
@@ -1083,7 +1233,15 @@
           <w:color w:val="27AE60"/>
           <w:sz w:val="18"/>
         </w:rPr>
-        <w:t xml:space="preserve">↻ Alternative: </w:t>
+        <w:t>↻</w:t>
+      </w:r>
+      <w:r>
+        <w:rPr>
+          <w:b/>
+          <w:color w:val="27AE60"/>
+          <w:sz w:val="18"/>
+        </w:rPr>
+        <w:t xml:space="preserve"> Alternative: </w:t>
       </w:r>
       <w:r>
         <w:rPr>
@@ -1138,7 +1296,14 @@
           <w:color w:val="FF6B35"/>
           <w:sz w:val="20"/>
         </w:rPr>
-        <w:t xml:space="preserve">▸ </w:t>
+        <w:t>▸</w:t>
+      </w:r>
+      <w:r>
+        <w:rPr>
+          <w:color w:val="FF6B35"/>
+          <w:sz w:val="20"/>
+        </w:rPr>
+        <w:t xml:space="preserve"> </w:t>
       </w:r>
       <w:r>
         <w:rPr>
@@ -1158,7 +1323,15 @@
           <w:color w:val="27AE60"/>
           <w:sz w:val="18"/>
         </w:rPr>
-        <w:t xml:space="preserve">↻ Alternative: </w:t>
+        <w:t>↻</w:t>
+      </w:r>
+      <w:r>
+        <w:rPr>
+          <w:b/>
+          <w:color w:val="27AE60"/>
+          <w:sz w:val="18"/>
+        </w:rPr>
+        <w:t xml:space="preserve"> Alternative: </w:t>
       </w:r>
       <w:r>
         <w:rPr>
@@ -1215,7 +1388,14 @@
                 <w:b/>
                 <w:color w:val="FF6B35"/>
               </w:rPr>
-              <w:t>📌 Nutrition Rules</w:t>
+              <w:t>📌</w:t>
+            </w:r>
+            <w:r>
+              <w:rPr>
+                <w:b/>
+                <w:color w:val="FF6B35"/>
+              </w:rPr>
+              <w:t xml:space="preserve"> Nutrition Rules</w:t>
             </w:r>
           </w:p>
           <w:p>
@@ -1273,7 +1453,15 @@
           <w:sz w:val="32"/>
         </w:rPr>
         <w:lastRenderedPageBreak/>
-        <w:t>💪  TRAINING SPLIT</w:t>
+        <w:t>💪</w:t>
+      </w:r>
+      <w:r>
+        <w:rPr>
+          <w:b/>
+          <w:color w:val="2980B9"/>
+          <w:sz w:val="32"/>
+        </w:rPr>
+        <w:t xml:space="preserve">  TRAINING SPLIT</w:t>
       </w:r>
     </w:p>
     <w:tbl>
@@ -1441,7 +1629,15 @@
                 <w:color w:val="27AE60"/>
                 <w:sz w:val="16"/>
               </w:rPr>
-              <w:t>↻ Alt: Dumbbell Bench Press (4x8-10)</w:t>
+              <w:t>↻</w:t>
+            </w:r>
+            <w:r>
+              <w:rPr>
+                <w:i/>
+                <w:color w:val="27AE60"/>
+                <w:sz w:val="16"/>
+              </w:rPr>
+              <w:t xml:space="preserve"> Alt: Dumbbell Bench Press (4x8-10)</w:t>
             </w:r>
           </w:p>
           <w:p>
@@ -1450,7 +1646,14 @@
                 <w:color w:val="95A5A6"/>
                 <w:sz w:val="16"/>
               </w:rPr>
-              <w:t>💡 Control the descent, full range of motion.</w:t>
+              <w:t>💡</w:t>
+            </w:r>
+            <w:r>
+              <w:rPr>
+                <w:color w:val="95A5A6"/>
+                <w:sz w:val="16"/>
+              </w:rPr>
+              <w:t xml:space="preserve"> Control the descent, full range of motion.</w:t>
             </w:r>
           </w:p>
         </w:tc>
@@ -1531,7 +1734,15 @@
                 <w:color w:val="27AE60"/>
                 <w:sz w:val="16"/>
               </w:rPr>
-              <w:t>↻ Alt: Incline Barbell Press (3x10-12)</w:t>
+              <w:t>↻</w:t>
+            </w:r>
+            <w:r>
+              <w:rPr>
+                <w:i/>
+                <w:color w:val="27AE60"/>
+                <w:sz w:val="16"/>
+              </w:rPr>
+              <w:t xml:space="preserve"> Alt: Incline Barbell Press (3x10-12)</w:t>
             </w:r>
           </w:p>
           <w:p>
@@ -1540,7 +1751,14 @@
                 <w:color w:val="95A5A6"/>
                 <w:sz w:val="16"/>
               </w:rPr>
-              <w:t>💡 Focus on upper chest activation.</w:t>
+              <w:t>💡</w:t>
+            </w:r>
+            <w:r>
+              <w:rPr>
+                <w:color w:val="95A5A6"/>
+                <w:sz w:val="16"/>
+              </w:rPr>
+              <w:t xml:space="preserve"> Focus on upper chest activation.</w:t>
             </w:r>
           </w:p>
         </w:tc>
@@ -1621,7 +1839,15 @@
                 <w:color w:val="27AE60"/>
                 <w:sz w:val="16"/>
               </w:rPr>
-              <w:t>↻ Alt: Pec Deck Fly Machine (3x12-15)</w:t>
+              <w:t>↻</w:t>
+            </w:r>
+            <w:r>
+              <w:rPr>
+                <w:i/>
+                <w:color w:val="27AE60"/>
+                <w:sz w:val="16"/>
+              </w:rPr>
+              <w:t xml:space="preserve"> Alt: Pec Deck Fly Machine (3x12-15)</w:t>
             </w:r>
           </w:p>
           <w:p>
@@ -1630,7 +1856,14 @@
                 <w:color w:val="95A5A6"/>
                 <w:sz w:val="16"/>
               </w:rPr>
-              <w:t>💡 Squeeze your chest at the peak contraction.</w:t>
+              <w:t>💡</w:t>
+            </w:r>
+            <w:r>
+              <w:rPr>
+                <w:color w:val="95A5A6"/>
+                <w:sz w:val="16"/>
+              </w:rPr>
+              <w:t xml:space="preserve"> Squeeze your chest at the peak contraction.</w:t>
             </w:r>
           </w:p>
         </w:tc>
@@ -1711,7 +1944,15 @@
                 <w:color w:val="27AE60"/>
                 <w:sz w:val="16"/>
               </w:rPr>
-              <w:t>↻ Alt: Straight-Arm Cable Pulldown (3x12-15)</w:t>
+              <w:t>↻</w:t>
+            </w:r>
+            <w:r>
+              <w:rPr>
+                <w:i/>
+                <w:color w:val="27AE60"/>
+                <w:sz w:val="16"/>
+              </w:rPr>
+              <w:t xml:space="preserve"> Alt: Straight-Arm Cable Pulldown (3x12-15)</w:t>
             </w:r>
           </w:p>
           <w:p>
@@ -1720,7 +1961,14 @@
                 <w:color w:val="95A5A6"/>
                 <w:sz w:val="16"/>
               </w:rPr>
-              <w:t>💡 Feel the stretch in your lats and chest.</w:t>
+              <w:t>💡</w:t>
+            </w:r>
+            <w:r>
+              <w:rPr>
+                <w:color w:val="95A5A6"/>
+                <w:sz w:val="16"/>
+              </w:rPr>
+              <w:t xml:space="preserve"> Feel the stretch in your lats and chest.</w:t>
             </w:r>
           </w:p>
         </w:tc>
@@ -1926,7 +2174,15 @@
                 <w:color w:val="27AE60"/>
                 <w:sz w:val="16"/>
               </w:rPr>
-              <w:t>↻ Alt: Machine Lat Pulldowns (4x8-10)</w:t>
+              <w:t>↻</w:t>
+            </w:r>
+            <w:r>
+              <w:rPr>
+                <w:i/>
+                <w:color w:val="27AE60"/>
+                <w:sz w:val="16"/>
+              </w:rPr>
+              <w:t xml:space="preserve"> Alt: Machine Lat Pulldowns (4x8-10)</w:t>
             </w:r>
           </w:p>
           <w:p>
@@ -1935,7 +2191,14 @@
                 <w:color w:val="95A5A6"/>
                 <w:sz w:val="16"/>
               </w:rPr>
-              <w:t>💡 Focus on pulling with your back, not just arms.</w:t>
+              <w:t>💡</w:t>
+            </w:r>
+            <w:r>
+              <w:rPr>
+                <w:color w:val="95A5A6"/>
+                <w:sz w:val="16"/>
+              </w:rPr>
+              <w:t xml:space="preserve"> Focus on pulling with your back, not just arms.</w:t>
             </w:r>
           </w:p>
         </w:tc>
@@ -2016,7 +2279,15 @@
                 <w:color w:val="27AE60"/>
                 <w:sz w:val="16"/>
               </w:rPr>
-              <w:t>↻ Alt: T-Bar Rows (4x8-10)</w:t>
+              <w:t>↻</w:t>
+            </w:r>
+            <w:r>
+              <w:rPr>
+                <w:i/>
+                <w:color w:val="27AE60"/>
+                <w:sz w:val="16"/>
+              </w:rPr>
+              <w:t xml:space="preserve"> Alt: T-Bar Rows (4x8-10)</w:t>
             </w:r>
           </w:p>
           <w:p>
@@ -2025,7 +2296,14 @@
                 <w:color w:val="95A5A6"/>
                 <w:sz w:val="16"/>
               </w:rPr>
-              <w:t>💡 Maintain a flat back throughout the movement.</w:t>
+              <w:t>💡</w:t>
+            </w:r>
+            <w:r>
+              <w:rPr>
+                <w:color w:val="95A5A6"/>
+                <w:sz w:val="16"/>
+              </w:rPr>
+              <w:t xml:space="preserve"> Maintain a flat back throughout the movement.</w:t>
             </w:r>
           </w:p>
         </w:tc>
@@ -2107,7 +2385,15 @@
                 <w:color w:val="27AE60"/>
                 <w:sz w:val="16"/>
               </w:rPr>
-              <w:t>↻ Alt: Machine Seated Rows (3x10-12)</w:t>
+              <w:t>↻</w:t>
+            </w:r>
+            <w:r>
+              <w:rPr>
+                <w:i/>
+                <w:color w:val="27AE60"/>
+                <w:sz w:val="16"/>
+              </w:rPr>
+              <w:t xml:space="preserve"> Alt: Machine Seated Rows (3x10-12)</w:t>
             </w:r>
           </w:p>
           <w:p>
@@ -2116,7 +2402,14 @@
                 <w:color w:val="95A5A6"/>
                 <w:sz w:val="16"/>
               </w:rPr>
-              <w:t>💡 Focus on squeezing your shoulder blade.</w:t>
+              <w:t>💡</w:t>
+            </w:r>
+            <w:r>
+              <w:rPr>
+                <w:color w:val="95A5A6"/>
+                <w:sz w:val="16"/>
+              </w:rPr>
+              <w:t xml:space="preserve"> Focus on squeezing your shoulder blade.</w:t>
             </w:r>
           </w:p>
         </w:tc>
@@ -2197,7 +2490,15 @@
                 <w:color w:val="27AE60"/>
                 <w:sz w:val="16"/>
               </w:rPr>
-              <w:t>↻ Alt: Reverse Pec Deck Fly (Rear Delt Focus) (3x12-15)</w:t>
+              <w:t>↻</w:t>
+            </w:r>
+            <w:r>
+              <w:rPr>
+                <w:i/>
+                <w:color w:val="27AE60"/>
+                <w:sz w:val="16"/>
+              </w:rPr>
+              <w:t xml:space="preserve"> Alt: Reverse Pec Deck Fly (Rear Delt Focus) (3x12-15)</w:t>
             </w:r>
           </w:p>
           <w:p>
@@ -2206,7 +2507,14 @@
                 <w:color w:val="95A5A6"/>
                 <w:sz w:val="16"/>
               </w:rPr>
-              <w:t>💡 Pull towards your face, externally rotating shoulders.</w:t>
+              <w:t>💡</w:t>
+            </w:r>
+            <w:r>
+              <w:rPr>
+                <w:color w:val="95A5A6"/>
+                <w:sz w:val="16"/>
+              </w:rPr>
+              <w:t xml:space="preserve"> Pull towards your face, externally rotating shoulders.</w:t>
             </w:r>
           </w:p>
         </w:tc>
@@ -2412,7 +2720,15 @@
                 <w:color w:val="27AE60"/>
                 <w:sz w:val="16"/>
               </w:rPr>
-              <w:t>↻ Alt: Hack Squats Machine (4x8-10)</w:t>
+              <w:t>↻</w:t>
+            </w:r>
+            <w:r>
+              <w:rPr>
+                <w:i/>
+                <w:color w:val="27AE60"/>
+                <w:sz w:val="16"/>
+              </w:rPr>
+              <w:t xml:space="preserve"> Alt: Hack Squats Machine (4x8-10)</w:t>
             </w:r>
           </w:p>
           <w:p>
@@ -2421,7 +2737,14 @@
                 <w:color w:val="95A5A6"/>
                 <w:sz w:val="16"/>
               </w:rPr>
-              <w:t>💡 Go to at least parallel, keep chest up.</w:t>
+              <w:t>💡</w:t>
+            </w:r>
+            <w:r>
+              <w:rPr>
+                <w:color w:val="95A5A6"/>
+                <w:sz w:val="16"/>
+              </w:rPr>
+              <w:t xml:space="preserve"> Go to at least parallel, keep chest up.</w:t>
             </w:r>
           </w:p>
         </w:tc>
@@ -2502,7 +2825,15 @@
                 <w:color w:val="27AE60"/>
                 <w:sz w:val="16"/>
               </w:rPr>
-              <w:t>↻ Alt: Good Mornings (3x10-12)</w:t>
+              <w:t>↻</w:t>
+            </w:r>
+            <w:r>
+              <w:rPr>
+                <w:i/>
+                <w:color w:val="27AE60"/>
+                <w:sz w:val="16"/>
+              </w:rPr>
+              <w:t xml:space="preserve"> Alt: Good Mornings (3x10-12)</w:t>
             </w:r>
           </w:p>
           <w:p>
@@ -2511,7 +2842,14 @@
                 <w:color w:val="95A5A6"/>
                 <w:sz w:val="16"/>
               </w:rPr>
-              <w:t>💡 Feel the stretch in your hamstrings.</w:t>
+              <w:t>💡</w:t>
+            </w:r>
+            <w:r>
+              <w:rPr>
+                <w:color w:val="95A5A6"/>
+                <w:sz w:val="16"/>
+              </w:rPr>
+              <w:t xml:space="preserve"> Feel the stretch in your hamstrings.</w:t>
             </w:r>
           </w:p>
         </w:tc>
@@ -2592,7 +2930,15 @@
                 <w:color w:val="27AE60"/>
                 <w:sz w:val="16"/>
               </w:rPr>
-              <w:t>↻ Alt: Goblet Squats (3x10-12)</w:t>
+              <w:t>↻</w:t>
+            </w:r>
+            <w:r>
+              <w:rPr>
+                <w:i/>
+                <w:color w:val="27AE60"/>
+                <w:sz w:val="16"/>
+              </w:rPr>
+              <w:t xml:space="preserve"> Alt: Goblet Squats (3x10-12)</w:t>
             </w:r>
           </w:p>
           <w:p>
@@ -2601,7 +2947,14 @@
                 <w:color w:val="95A5A6"/>
                 <w:sz w:val="16"/>
               </w:rPr>
-              <w:t>💡 Vary foot placement to target different areas.</w:t>
+              <w:t>💡</w:t>
+            </w:r>
+            <w:r>
+              <w:rPr>
+                <w:color w:val="95A5A6"/>
+                <w:sz w:val="16"/>
+              </w:rPr>
+              <w:t xml:space="preserve"> Vary foot placement to target different areas.</w:t>
             </w:r>
           </w:p>
         </w:tc>
@@ -2682,7 +3035,15 @@
                 <w:color w:val="27AE60"/>
                 <w:sz w:val="16"/>
               </w:rPr>
-              <w:t>↻ Alt: Sissy Squats (3x12-15)</w:t>
+              <w:t>↻</w:t>
+            </w:r>
+            <w:r>
+              <w:rPr>
+                <w:i/>
+                <w:color w:val="27AE60"/>
+                <w:sz w:val="16"/>
+              </w:rPr>
+              <w:t xml:space="preserve"> Alt: Sissy Squats (3x12-15)</w:t>
             </w:r>
           </w:p>
           <w:p>
@@ -2691,7 +3052,14 @@
                 <w:color w:val="95A5A6"/>
                 <w:sz w:val="16"/>
               </w:rPr>
-              <w:t>💡 Squeeze your quads at the top.</w:t>
+              <w:t>💡</w:t>
+            </w:r>
+            <w:r>
+              <w:rPr>
+                <w:color w:val="95A5A6"/>
+                <w:sz w:val="16"/>
+              </w:rPr>
+              <w:t xml:space="preserve"> Squeeze your quads at the top.</w:t>
             </w:r>
           </w:p>
         </w:tc>
@@ -2772,7 +3140,15 @@
                 <w:color w:val="27AE60"/>
                 <w:sz w:val="16"/>
               </w:rPr>
-              <w:t>↻ Alt: Standing Calf Raises (3x15-20)</w:t>
+              <w:t>↻</w:t>
+            </w:r>
+            <w:r>
+              <w:rPr>
+                <w:i/>
+                <w:color w:val="27AE60"/>
+                <w:sz w:val="16"/>
+              </w:rPr>
+              <w:t xml:space="preserve"> Alt: Standing Calf Raises (3x15-20)</w:t>
             </w:r>
           </w:p>
           <w:p>
@@ -2781,7 +3157,14 @@
                 <w:color w:val="95A5A6"/>
                 <w:sz w:val="16"/>
               </w:rPr>
-              <w:t>💡 Full stretch at the bottom, squeeze at the top.</w:t>
+              <w:t>💡</w:t>
+            </w:r>
+            <w:r>
+              <w:rPr>
+                <w:color w:val="95A5A6"/>
+                <w:sz w:val="16"/>
+              </w:rPr>
+              <w:t xml:space="preserve"> Full stretch at the bottom, squeeze at the top.</w:t>
             </w:r>
           </w:p>
         </w:tc>
@@ -2986,7 +3369,15 @@
                 <w:color w:val="27AE60"/>
                 <w:sz w:val="16"/>
               </w:rPr>
-              <w:t>↻ Alt: Seated Dumbbell Shoulder Press (4x8-10)</w:t>
+              <w:t>↻</w:t>
+            </w:r>
+            <w:r>
+              <w:rPr>
+                <w:i/>
+                <w:color w:val="27AE60"/>
+                <w:sz w:val="16"/>
+              </w:rPr>
+              <w:t xml:space="preserve"> Alt: Seated Dumbbell Shoulder Press (4x8-10)</w:t>
             </w:r>
           </w:p>
           <w:p>
@@ -2995,7 +3386,14 @@
                 <w:color w:val="95A5A6"/>
                 <w:sz w:val="16"/>
               </w:rPr>
-              <w:t>💡 Press directly overhead, brace your core.</w:t>
+              <w:t>💡</w:t>
+            </w:r>
+            <w:r>
+              <w:rPr>
+                <w:color w:val="95A5A6"/>
+                <w:sz w:val="16"/>
+              </w:rPr>
+              <w:t xml:space="preserve"> Press directly overhead, brace your core.</w:t>
             </w:r>
           </w:p>
         </w:tc>
@@ -3076,7 +3474,15 @@
                 <w:color w:val="27AE60"/>
                 <w:sz w:val="16"/>
               </w:rPr>
-              <w:t>↻ Alt: Cable Lateral Raises (3x12-15)</w:t>
+              <w:t>↻</w:t>
+            </w:r>
+            <w:r>
+              <w:rPr>
+                <w:i/>
+                <w:color w:val="27AE60"/>
+                <w:sz w:val="16"/>
+              </w:rPr>
+              <w:t xml:space="preserve"> Alt: Cable Lateral Raises (3x12-15)</w:t>
             </w:r>
           </w:p>
           <w:p>
@@ -3085,7 +3491,14 @@
                 <w:color w:val="95A5A6"/>
                 <w:sz w:val="16"/>
               </w:rPr>
-              <w:t>💡 Lead with your elbows, avoid shrugging.</w:t>
+              <w:t>💡</w:t>
+            </w:r>
+            <w:r>
+              <w:rPr>
+                <w:color w:val="95A5A6"/>
+                <w:sz w:val="16"/>
+              </w:rPr>
+              <w:t xml:space="preserve"> Lead with your elbows, avoid shrugging.</w:t>
             </w:r>
           </w:p>
         </w:tc>
@@ -3166,7 +3579,15 @@
                 <w:color w:val="27AE60"/>
                 <w:sz w:val="16"/>
               </w:rPr>
-              <w:t>↻ Alt: Bent-Over Dumbbell Lateral Raises (3x12-15)</w:t>
+              <w:t>↻</w:t>
+            </w:r>
+            <w:r>
+              <w:rPr>
+                <w:i/>
+                <w:color w:val="27AE60"/>
+                <w:sz w:val="16"/>
+              </w:rPr>
+              <w:t xml:space="preserve"> Alt: Bent-Over Dumbbell Lateral Raises (3x12-15)</w:t>
             </w:r>
           </w:p>
           <w:p>
@@ -3175,7 +3596,14 @@
                 <w:color w:val="95A5A6"/>
                 <w:sz w:val="16"/>
               </w:rPr>
-              <w:t>💡 Focus on squeezing your rear delts.</w:t>
+              <w:t>💡</w:t>
+            </w:r>
+            <w:r>
+              <w:rPr>
+                <w:color w:val="95A5A6"/>
+                <w:sz w:val="16"/>
+              </w:rPr>
+              <w:t xml:space="preserve"> Focus on squeezing your rear delts.</w:t>
             </w:r>
           </w:p>
         </w:tc>
@@ -3256,7 +3684,15 @@
                 <w:color w:val="27AE60"/>
                 <w:sz w:val="16"/>
               </w:rPr>
-              <w:t>↻ Alt: Skullcrushers (3x10-12)</w:t>
+              <w:t>↻</w:t>
+            </w:r>
+            <w:r>
+              <w:rPr>
+                <w:i/>
+                <w:color w:val="27AE60"/>
+                <w:sz w:val="16"/>
+              </w:rPr>
+              <w:t xml:space="preserve"> Alt: Skullcrushers (3x10-12)</w:t>
             </w:r>
           </w:p>
           <w:p>
@@ -3265,7 +3701,14 @@
                 <w:color w:val="95A5A6"/>
                 <w:sz w:val="16"/>
               </w:rPr>
-              <w:t>💡 Keep elbows tucked in to target triceps.</w:t>
+              <w:t>💡</w:t>
+            </w:r>
+            <w:r>
+              <w:rPr>
+                <w:color w:val="95A5A6"/>
+                <w:sz w:val="16"/>
+              </w:rPr>
+              <w:t xml:space="preserve"> Keep elbows tucked in to target triceps.</w:t>
             </w:r>
           </w:p>
         </w:tc>
@@ -3346,7 +3789,15 @@
                 <w:color w:val="27AE60"/>
                 <w:sz w:val="16"/>
               </w:rPr>
-              <w:t>↻ Alt: Rope Overhead Extension (3x12-15)</w:t>
+              <w:t>↻</w:t>
+            </w:r>
+            <w:r>
+              <w:rPr>
+                <w:i/>
+                <w:color w:val="27AE60"/>
+                <w:sz w:val="16"/>
+              </w:rPr>
+              <w:t xml:space="preserve"> Alt: Rope Overhead Extension (3x12-15)</w:t>
             </w:r>
           </w:p>
           <w:p>
@@ -3355,7 +3806,14 @@
                 <w:color w:val="95A5A6"/>
                 <w:sz w:val="16"/>
               </w:rPr>
-              <w:t>💡 Full stretch at the bottom, lock out at the top.</w:t>
+              <w:t>💡</w:t>
+            </w:r>
+            <w:r>
+              <w:rPr>
+                <w:color w:val="95A5A6"/>
+                <w:sz w:val="16"/>
+              </w:rPr>
+              <w:t xml:space="preserve"> Full stretch at the bottom, lock out at the top.</w:t>
             </w:r>
           </w:p>
         </w:tc>
@@ -3559,7 +4017,15 @@
                 <w:color w:val="27AE60"/>
                 <w:sz w:val="16"/>
               </w:rPr>
-              <w:t>↻ Alt: EZ Bar Curls (4x8-10)</w:t>
+              <w:t>↻</w:t>
+            </w:r>
+            <w:r>
+              <w:rPr>
+                <w:i/>
+                <w:color w:val="27AE60"/>
+                <w:sz w:val="16"/>
+              </w:rPr>
+              <w:t xml:space="preserve"> Alt: EZ Bar Curls (4x8-10)</w:t>
             </w:r>
           </w:p>
           <w:p>
@@ -3568,7 +4034,14 @@
                 <w:color w:val="95A5A6"/>
                 <w:sz w:val="16"/>
               </w:rPr>
-              <w:t>💡 Keep elbows pinned to your sides, control the movement.</w:t>
+              <w:t>💡</w:t>
+            </w:r>
+            <w:r>
+              <w:rPr>
+                <w:color w:val="95A5A6"/>
+                <w:sz w:val="16"/>
+              </w:rPr>
+              <w:t xml:space="preserve"> Keep elbows pinned to your sides, control the movement.</w:t>
             </w:r>
           </w:p>
         </w:tc>
@@ -3650,7 +4123,15 @@
                 <w:color w:val="27AE60"/>
                 <w:sz w:val="16"/>
               </w:rPr>
-              <w:t>↻ Alt: Preacher Curls (3x10-12)</w:t>
+              <w:t>↻</w:t>
+            </w:r>
+            <w:r>
+              <w:rPr>
+                <w:i/>
+                <w:color w:val="27AE60"/>
+                <w:sz w:val="16"/>
+              </w:rPr>
+              <w:t xml:space="preserve"> Alt: Preacher Curls (3x10-12)</w:t>
             </w:r>
           </w:p>
           <w:p>
@@ -3659,7 +4140,14 @@
                 <w:color w:val="95A5A6"/>
                 <w:sz w:val="16"/>
               </w:rPr>
-              <w:t>💡 Allows for a greater stretch at the bottom.</w:t>
+              <w:t>💡</w:t>
+            </w:r>
+            <w:r>
+              <w:rPr>
+                <w:color w:val="95A5A6"/>
+                <w:sz w:val="16"/>
+              </w:rPr>
+              <w:t xml:space="preserve"> Allows for a greater stretch at the bottom.</w:t>
             </w:r>
           </w:p>
         </w:tc>
@@ -3740,7 +4228,15 @@
                 <w:color w:val="27AE60"/>
                 <w:sz w:val="16"/>
               </w:rPr>
-              <w:t>↻ Alt: Rope Hammer Curls (3x10-12)</w:t>
+              <w:t>↻</w:t>
+            </w:r>
+            <w:r>
+              <w:rPr>
+                <w:i/>
+                <w:color w:val="27AE60"/>
+                <w:sz w:val="16"/>
+              </w:rPr>
+              <w:t xml:space="preserve"> Alt: Rope Hammer Curls (3x10-12)</w:t>
             </w:r>
           </w:p>
           <w:p>
@@ -3749,7 +4245,14 @@
                 <w:color w:val="95A5A6"/>
                 <w:sz w:val="16"/>
               </w:rPr>
-              <w:t>💡 Targets both the biceps and brachialis.</w:t>
+              <w:t>💡</w:t>
+            </w:r>
+            <w:r>
+              <w:rPr>
+                <w:color w:val="95A5A6"/>
+                <w:sz w:val="16"/>
+              </w:rPr>
+              <w:t xml:space="preserve"> Targets both the biceps and brachialis.</w:t>
             </w:r>
           </w:p>
         </w:tc>
@@ -3830,7 +4333,15 @@
                 <w:color w:val="27AE60"/>
                 <w:sz w:val="16"/>
               </w:rPr>
-              <w:t>↻ Alt: Machine Crunches (3x15-20)</w:t>
+              <w:t>↻</w:t>
+            </w:r>
+            <w:r>
+              <w:rPr>
+                <w:i/>
+                <w:color w:val="27AE60"/>
+                <w:sz w:val="16"/>
+              </w:rPr>
+              <w:t xml:space="preserve"> Alt: Machine Crunches (3x15-20)</w:t>
             </w:r>
           </w:p>
           <w:p>
@@ -3839,7 +4350,14 @@
                 <w:color w:val="95A5A6"/>
                 <w:sz w:val="16"/>
               </w:rPr>
-              <w:t>💡 Crunch with your abs, not just pulling with arms/hips.</w:t>
+              <w:t>💡</w:t>
+            </w:r>
+            <w:r>
+              <w:rPr>
+                <w:color w:val="95A5A6"/>
+                <w:sz w:val="16"/>
+              </w:rPr>
+              <w:t xml:space="preserve"> Crunch with your abs, not just pulling with arms/hips.</w:t>
             </w:r>
           </w:p>
         </w:tc>
@@ -3920,7 +4438,15 @@
                 <w:color w:val="27AE60"/>
                 <w:sz w:val="16"/>
               </w:rPr>
-              <w:t>↻ Alt: Reverse Crunches (3x15-20)</w:t>
+              <w:t>↻</w:t>
+            </w:r>
+            <w:r>
+              <w:rPr>
+                <w:i/>
+                <w:color w:val="27AE60"/>
+                <w:sz w:val="16"/>
+              </w:rPr>
+              <w:t xml:space="preserve"> Alt: Reverse Crunches (3x15-20)</w:t>
             </w:r>
           </w:p>
           <w:p>
@@ -3929,7 +4455,14 @@
                 <w:color w:val="95A5A6"/>
                 <w:sz w:val="16"/>
               </w:rPr>
-              <w:t>💡 Focus on lifting your hips, not just legs.</w:t>
+              <w:t>💡</w:t>
+            </w:r>
+            <w:r>
+              <w:rPr>
+                <w:color w:val="95A5A6"/>
+                <w:sz w:val="16"/>
+              </w:rPr>
+              <w:t xml:space="preserve"> Focus on lifting your hips, not just legs.</w:t>
             </w:r>
           </w:p>
         </w:tc>
@@ -3978,7 +4511,14 @@
           <w:i/>
           <w:color w:val="6C28D2"/>
         </w:rPr>
-        <w:t>🧘 Saturday &amp; Sunday: Rest / Active Recovery (light walk, stretching, yoga)</w:t>
+        <w:t>🧘</w:t>
+      </w:r>
+      <w:r>
+        <w:rPr>
+          <w:i/>
+          <w:color w:val="6C28D2"/>
+        </w:rPr>
+        <w:t xml:space="preserve"> Saturday &amp; Sunday: Rest / Active Recovery (light walk, stretching, yoga)</w:t>
       </w:r>
     </w:p>
     <w:p/>
@@ -3992,7 +4532,15 @@
           <w:color w:val="27AE60"/>
           <w:sz w:val="32"/>
         </w:rPr>
-        <w:t>💊  RECOMMENDED SUPPLEMENTS</w:t>
+        <w:t>💊</w:t>
+      </w:r>
+      <w:r>
+        <w:rPr>
+          <w:b/>
+          <w:color w:val="27AE60"/>
+          <w:sz w:val="32"/>
+        </w:rPr>
+        <w:t xml:space="preserve">  RECOMMENDED SUPPLEMENTS</w:t>
       </w:r>
     </w:p>
     <w:tbl>
@@ -4168,14 +4716,43 @@
     <w:p>
       <w:pPr>
         <w:spacing w:before="400"/>
+        <w:rPr>
+          <w:b/>
+          <w:color w:val="2D0A6E"/>
+          <w:sz w:val="32"/>
+        </w:rPr>
       </w:pPr>
+    </w:p>
+    <w:p>
+      <w:pPr>
+        <w:spacing w:before="400"/>
+      </w:pPr>
+      <w:proofErr w:type="gramStart"/>
       <w:r>
         <w:rPr>
           <w:b/>
           <w:color w:val="2D0A6E"/>
           <w:sz w:val="32"/>
         </w:rPr>
-        <w:t>⚡  LIFESTYLE UPGRADE</w:t>
+        <w:lastRenderedPageBreak/>
+        <w:t>⚡</w:t>
+      </w:r>
+      <w:r>
+        <w:rPr>
+          <w:b/>
+          <w:color w:val="2D0A6E"/>
+          <w:sz w:val="32"/>
+        </w:rPr>
+        <w:t xml:space="preserve">  LIFESTYLE</w:t>
+      </w:r>
+      <w:proofErr w:type="gramEnd"/>
+      <w:r>
+        <w:rPr>
+          <w:b/>
+          <w:color w:val="2D0A6E"/>
+          <w:sz w:val="32"/>
+        </w:rPr>
+        <w:t xml:space="preserve"> UPGRADE</w:t>
       </w:r>
     </w:p>
     <w:p>
@@ -4184,8 +4761,13 @@
         <w:ind w:left="432"/>
       </w:pPr>
       <w:r>
-        <w:lastRenderedPageBreak/>
-        <w:t xml:space="preserve">  🌙  </w:t>
+        <w:t xml:space="preserve">  </w:t>
+      </w:r>
+      <w:r>
+        <w:t>🌙</w:t>
+      </w:r>
+      <w:r>
+        <w:t xml:space="preserve">  </w:t>
       </w:r>
       <w:r>
         <w:rPr>
@@ -4200,7 +4782,13 @@
         <w:ind w:left="432"/>
       </w:pPr>
       <w:r>
-        <w:t xml:space="preserve">  🚶  </w:t>
+        <w:t xml:space="preserve">  </w:t>
+      </w:r>
+      <w:r>
+        <w:t>🚶</w:t>
+      </w:r>
+      <w:r>
+        <w:t xml:space="preserve">  </w:t>
       </w:r>
       <w:r>
         <w:rPr>
@@ -4215,7 +4803,13 @@
         <w:ind w:left="432"/>
       </w:pPr>
       <w:r>
-        <w:t xml:space="preserve">  📱  </w:t>
+        <w:t xml:space="preserve">  </w:t>
+      </w:r>
+      <w:r>
+        <w:t>📱</w:t>
+      </w:r>
+      <w:r>
+        <w:t xml:space="preserve">  </w:t>
       </w:r>
       <w:r>
         <w:rPr>
@@ -4230,7 +4824,13 @@
         <w:ind w:left="432"/>
       </w:pPr>
       <w:r>
-        <w:t xml:space="preserve">  🧠  </w:t>
+        <w:t xml:space="preserve">  </w:t>
+      </w:r>
+      <w:r>
+        <w:t>🧠</w:t>
+      </w:r>
+      <w:r>
+        <w:t xml:space="preserve">  </w:t>
       </w:r>
       <w:r>
         <w:rPr>

</xml_diff>